<commit_message>
Store daily recap Word us_market_recap_2026-10-14_BJT_us_2026-10-13_final
</commit_message>
<xml_diff>
--- a/reports/us_market_recap_2026-10-14_BJT_us_2026-10-13_final.docx
+++ b/reports/us_market_recap_2026-10-14_BJT_us_2026-10-13_final.docx
@@ -30,19 +30,85 @@
         <w:rPr>
           <w:highlight w:val="yellow"/>
         </w:rPr>
-        <w:t xml:space="preserve">结论先行：这是一个“指数近乎横盘、内部轮动明显”的交易日。道指 +0.38%，标普500 -0.06%，纳指 -0.44%，Russell 2000 -0.45%；但标普成分股上涨 321 家、下跌 179 家，涨跌比约 1.79。资金从高估值 </w:t>
+        <w:t xml:space="preserve">结论先行：指数表现为道指 -0.35%、标普500 -0.02%、纳指 -0.15%、Russell 2000 -0.40%；S&amp;P 500 广度为上涨 265、下跌 237，涨跌比 1.12。板块当日相对强弱由 </w:t>
+      </w:r>
+      <w:r>
+        <w:rPr>
+          <w:highlight w:val="yellow"/>
+          <w:shd w:fill="E7E6E6"/>
+        </w:rPr>
+        <w:t>XLE</w:t>
       </w:r>
       <w:r>
         <w:rPr>
           <w:highlight w:val="yellow"/>
         </w:rPr>
-        <w:t>AI</w:t>
+        <w:t>（能源）+1.80%、</w:t>
+      </w:r>
+      <w:r>
+        <w:rPr>
+          <w:highlight w:val="yellow"/>
+          <w:shd w:fill="E7E6E6"/>
+        </w:rPr>
+        <w:t>XLC</w:t>
       </w:r>
       <w:r>
         <w:rPr>
           <w:highlight w:val="yellow"/>
         </w:rPr>
-        <w:t xml:space="preserve"> 硬件与高 Beta 方向撤出，转向能源、必选消费、医疗、通信服务和部分防御资产。</w:t>
+        <w:t>（通信服务）+0.74%、</w:t>
+      </w:r>
+      <w:r>
+        <w:rPr>
+          <w:highlight w:val="yellow"/>
+          <w:shd w:fill="E7E6E6"/>
+        </w:rPr>
+        <w:t>XHB</w:t>
+      </w:r>
+      <w:r>
+        <w:rPr>
+          <w:highlight w:val="yellow"/>
+        </w:rPr>
+        <w:t>（住宅建筑）+0.62% 领跑，</w:t>
+      </w:r>
+      <w:r>
+        <w:rPr>
+          <w:highlight w:val="yellow"/>
+          <w:shd w:fill="E7E6E6"/>
+        </w:rPr>
+        <w:t>XLV</w:t>
+      </w:r>
+      <w:r>
+        <w:rPr>
+          <w:highlight w:val="yellow"/>
+        </w:rPr>
+        <w:t>（医疗保健）-1.35%、</w:t>
+      </w:r>
+      <w:r>
+        <w:rPr>
+          <w:highlight w:val="yellow"/>
+          <w:shd w:fill="E7E6E6"/>
+        </w:rPr>
+        <w:t>GDX</w:t>
+      </w:r>
+      <w:r>
+        <w:rPr>
+          <w:highlight w:val="yellow"/>
+        </w:rPr>
+        <w:t>（黄金矿业）-1.46%、</w:t>
+      </w:r>
+      <w:r>
+        <w:rPr>
+          <w:highlight w:val="yellow"/>
+          <w:shd w:fill="E7E6E6"/>
+        </w:rPr>
+        <w:t>XBI</w:t>
+      </w:r>
+      <w:r>
+        <w:rPr>
+          <w:highlight w:val="yellow"/>
+        </w:rPr>
+        <w:t>（生物医药）-3.04% 落后；这是当天价格与广度观察，不把固定公司名单预设为催化。</w:t>
       </w:r>
     </w:p>
     <w:p>
@@ -947,7 +1013,7 @@
                 <w:color w:val="141414"/>
                 <w:sz w:val="16"/>
               </w:rPr>
-              <w:t>102.20 / 94.83 / 83,397.73</w:t>
+              <w:t>102.17 / 94.81 / 83,397.73</w:t>
             </w:r>
           </w:p>
         </w:tc>
@@ -1096,7 +1162,7 @@
         <w:spacing w:after="120" w:line="276" w:lineRule="auto"/>
       </w:pPr>
       <w:r>
-        <w:t>图表读法：当日最强为能源（</w:t>
+        <w:t xml:space="preserve">图表读法：当日相对最强为 </w:t>
       </w:r>
       <w:r>
         <w:rPr>
@@ -1105,16 +1171,7 @@
         <w:t>XLE</w:t>
       </w:r>
       <w:r>
-        <w:t xml:space="preserve"> +1.43%）、必选消费（</w:t>
-      </w:r>
-      <w:r>
-        <w:rPr>
-          <w:shd w:fill="E7E6E6"/>
-        </w:rPr>
-        <w:t>XLP</w:t>
-      </w:r>
-      <w:r>
-        <w:t xml:space="preserve"> +1.17%）、通信服务（</w:t>
+        <w:t>（能源）+1.80%、</w:t>
       </w:r>
       <w:r>
         <w:rPr>
@@ -1123,25 +1180,49 @@
         <w:t>XLC</w:t>
       </w:r>
       <w:r>
-        <w:t xml:space="preserve"> +0.97%）；科技（</w:t>
+        <w:t>（通信服务）+0.74%、</w:t>
       </w:r>
       <w:r>
         <w:rPr>
           <w:shd w:fill="E7E6E6"/>
         </w:rPr>
-        <w:t>XLK</w:t>
+        <w:t>XHB</w:t>
       </w:r>
       <w:r>
-        <w:t xml:space="preserve"> -1.22%）与半导体代理（</w:t>
+        <w:t xml:space="preserve">（住宅建筑）+0.62%，相对最弱为 </w:t>
       </w:r>
       <w:r>
         <w:rPr>
           <w:shd w:fill="E7E6E6"/>
         </w:rPr>
-        <w:t>SOXX</w:t>
+        <w:t>XLV</w:t>
       </w:r>
       <w:r>
-        <w:t xml:space="preserve"> -2.60%）明显落后。结合上涨家数占比 63.8%，可判定为“风险偏好没有全面崩坏，但高拥挤成长资产被主动降仓”。</w:t>
+        <w:t>（医疗保健）-1.35%、</w:t>
+      </w:r>
+      <w:r>
+        <w:rPr>
+          <w:shd w:fill="E7E6E6"/>
+        </w:rPr>
+        <w:t>GDX</w:t>
+      </w:r>
+      <w:r>
+        <w:t>（黄金矿业）-1.46%、</w:t>
+      </w:r>
+      <w:r>
+        <w:rPr>
+          <w:shd w:fill="E7E6E6"/>
+        </w:rPr>
+        <w:t>XBI</w:t>
+      </w:r>
+      <w:r>
+        <w:t xml:space="preserve">（生物医药）-3.04%；上涨占比 52.7%。需要把 </w:t>
+      </w:r>
+      <w:r>
+        <w:t>ETF</w:t>
+      </w:r>
+      <w:r>
+        <w:t xml:space="preserve"> 表现和单股异常分开读，不能用行业平均替代个股催化。</w:t>
       </w:r>
     </w:p>
     <w:p>
@@ -1211,58 +1292,52 @@
         <w:spacing w:after="120" w:line="276" w:lineRule="auto"/>
       </w:pPr>
       <w:r>
-        <w:t xml:space="preserve">资金方向判断：短线流入能源、必选消费、医疗保健、房地产和通信服务，流出科技、材料与可选消费；20日维度则仍保留半导体、软件/网络和 </w:t>
-      </w:r>
-      <w:r>
-        <w:t>AI</w:t>
-      </w:r>
-      <w:r>
-        <w:t xml:space="preserve"> 相关资产的历史强势，因此今天更像高位主题内部的去杠杆，而不是趋势彻底反转。科技板块内部不能只看 </w:t>
+        <w:t xml:space="preserve">资金方向判断：价格代理显示相对偏好集中在 </w:t>
       </w:r>
       <w:r>
         <w:rPr>
           <w:shd w:fill="E7E6E6"/>
         </w:rPr>
-        <w:t>XLK</w:t>
+        <w:t>XLE</w:t>
       </w:r>
       <w:r>
-        <w:t>：</w:t>
+        <w:t>（能源）+1.80%、</w:t>
       </w:r>
       <w:r>
         <w:rPr>
           <w:shd w:fill="E7E6E6"/>
         </w:rPr>
-        <w:t>SOXX</w:t>
+        <w:t>XLC</w:t>
       </w:r>
       <w:r>
-        <w:t>/</w:t>
+        <w:t>（通信服务）+0.74%、</w:t>
       </w:r>
       <w:r>
         <w:rPr>
           <w:shd w:fill="E7E6E6"/>
         </w:rPr>
-        <w:t>SMH</w:t>
+        <w:t>XHB</w:t>
       </w:r>
       <w:r>
-        <w:t>、</w:t>
+        <w:t xml:space="preserve">（住宅建筑）+0.62%，相对压力集中在 </w:t>
       </w:r>
       <w:r>
         <w:rPr>
           <w:shd w:fill="E7E6E6"/>
         </w:rPr>
-        <w:t>CIBR</w:t>
+        <w:t>XLV</w:t>
       </w:r>
       <w:r>
-        <w:t>、</w:t>
+        <w:t>（医疗保健）-1.35%、</w:t>
       </w:r>
       <w:r>
         <w:rPr>
           <w:shd w:fill="E7E6E6"/>
         </w:rPr>
-        <w:t>SKYY</w:t>
+        <w:t>GDX</w:t>
       </w:r>
       <w:r>
-        <w:t xml:space="preserve"> 和 </w:t>
+        <w:t>（黄金矿业）-1.46%、</w:t>
       </w:r>
       <w:r>
         <w:rPr>
@@ -1271,25 +1346,19 @@
         <w:t>XBI</w:t>
       </w:r>
       <w:r>
-        <w:t xml:space="preserve"> 进一步走弱，而 </w:t>
+        <w:t xml:space="preserve">（生物医药）-3.04%；20日维度需要结合热图判断是否只是短期反转。没有直接 </w:t>
       </w:r>
       <w:r>
-        <w:rPr>
-          <w:shd w:fill="E7E6E6"/>
-        </w:rPr>
-        <w:t>IHI</w:t>
+        <w:t>ETF</w:t>
       </w:r>
       <w:r>
-        <w:t>、</w:t>
+        <w:t>/</w:t>
       </w:r>
       <w:r>
-        <w:rPr>
-          <w:shd w:fill="E7E6E6"/>
-        </w:rPr>
-        <w:t>XHE</w:t>
+        <w:t>PB</w:t>
       </w:r>
       <w:r>
-        <w:t xml:space="preserve"> 体现医疗器械相对韧性。</w:t>
+        <w:t xml:space="preserve"> 净流数据时，报告使用“价格偏好/轮动代理”，不把相对涨跌写成已证实的净流入或净流出。</w:t>
       </w:r>
     </w:p>
     <w:p>
@@ -1350,7 +1419,7 @@
         <w:spacing w:after="120" w:line="276" w:lineRule="auto"/>
       </w:pPr>
       <w:r>
-        <w:t xml:space="preserve">异常个股必须回填在行业图旁：光通信链条 </w:t>
+        <w:t xml:space="preserve">异常个股必须回填在行业图旁：本次扫描得到 </w:t>
       </w:r>
       <w:r>
         <w:rPr>
@@ -1359,7 +1428,7 @@
         <w:t>LITE</w:t>
       </w:r>
       <w:r>
-        <w:t xml:space="preserve"> -9.78%、</w:t>
+        <w:t xml:space="preserve"> -0.75%、</w:t>
       </w:r>
       <w:r>
         <w:rPr>
@@ -1368,7 +1437,7 @@
         <w:t>CIEN</w:t>
       </w:r>
       <w:r>
-        <w:t xml:space="preserve"> -9.95%、</w:t>
+        <w:t xml:space="preserve"> -1.14%、</w:t>
       </w:r>
       <w:r>
         <w:rPr>
@@ -1377,7 +1446,7 @@
         <w:t>COHR</w:t>
       </w:r>
       <w:r>
-        <w:t xml:space="preserve"> -7.87%、</w:t>
+        <w:t xml:space="preserve"> +0.68%、</w:t>
       </w:r>
       <w:r>
         <w:rPr>
@@ -1386,7 +1455,7 @@
         <w:t>AAOI</w:t>
       </w:r>
       <w:r>
-        <w:t xml:space="preserve"> -8.17%、</w:t>
+        <w:t xml:space="preserve"> -2.88%、</w:t>
       </w:r>
       <w:r>
         <w:rPr>
@@ -1395,13 +1464,7 @@
         <w:t>CRDO</w:t>
       </w:r>
       <w:r>
-        <w:t xml:space="preserve"> -7.25%，明显弱于通信服务 </w:t>
-      </w:r>
-      <w:r>
-        <w:t>ETF</w:t>
-      </w:r>
-      <w:r>
-        <w:t>，说明行业指数掩盖了硬件子组的集中抛压；</w:t>
+        <w:t xml:space="preserve"> -1.26%、</w:t>
       </w:r>
       <w:r>
         <w:rPr>
@@ -1410,7 +1473,7 @@
         <w:t>FICO</w:t>
       </w:r>
       <w:r>
-        <w:t xml:space="preserve"> +10.85%、</w:t>
+        <w:t xml:space="preserve"> -2.29%、</w:t>
       </w:r>
       <w:r>
         <w:rPr>
@@ -1419,7 +1482,7 @@
         <w:t>FIGS</w:t>
       </w:r>
       <w:r>
-        <w:t xml:space="preserve"> +12.42%、</w:t>
+        <w:t xml:space="preserve"> +1.47%、</w:t>
       </w:r>
       <w:r>
         <w:rPr>
@@ -1428,7 +1491,13 @@
         <w:t>MDT</w:t>
       </w:r>
       <w:r>
-        <w:t xml:space="preserve"> +3.90%则是单股驱动，不能被简单归入“金融、可选消费或医疗整体上涨”。</w:t>
+        <w:t xml:space="preserve"> +1.17%。这些是价格/成交异常候选，若当天没有新公告、研报、公司交流或可验证传闻，只能标为结构性重定价或待验，不能把行业 </w:t>
+      </w:r>
+      <w:r>
+        <w:t>ETF</w:t>
+      </w:r>
+      <w:r>
+        <w:t xml:space="preserve"> 变化直接当成单股原因。</w:t>
       </w:r>
     </w:p>
     <w:p>
@@ -1542,16 +1611,13 @@
         <w:spacing w:after="120" w:line="276" w:lineRule="auto"/>
       </w:pPr>
       <w:r>
-        <w:t>图表解读：半导体等权当日约 -2.07%，软件约 -1.48%，价差约 -1.37 个百分点，意味着软件相对抗跌；但过去 20 日半导体仍明显占优，故今天更接近短期估值/仓位再平衡。不能把“半导体下跌”泛化为整个科技板块都弱，</w:t>
+        <w:t>图表解读：半导体等权当日 -0.38%，软件等权 -0.18%，价差（Semi - Software）-0.20 个百分点；正值表示半导体相对跑赢，负值表示软件相对跑赢。两者绝对涨跌、</w:t>
       </w:r>
       <w:r>
-        <w:rPr>
-          <w:shd w:fill="E7E6E6"/>
-        </w:rPr>
-        <w:t>META</w:t>
+        <w:t>ETF</w:t>
       </w:r>
       <w:r>
-        <w:t xml:space="preserve"> +3.38%就是大型平台股的反例。</w:t>
+        <w:t xml:space="preserve"> 权重和中位数可能不同，不能只凭价差判断整个科技板块方向。</w:t>
       </w:r>
     </w:p>
     <w:p>
@@ -3373,7 +3439,7 @@
                 <w:color w:val="141414"/>
                 <w:sz w:val="16"/>
               </w:rPr>
-              <w:t>META / Muse Wonder</w:t>
+              <w:t>META</w:t>
             </w:r>
           </w:p>
         </w:tc>
@@ -3399,7 +3465,7 @@
                 <w:color w:val="141414"/>
                 <w:sz w:val="16"/>
               </w:rPr>
-              <w:t>META +3.38%；官方发布 Muse Wonder 与 Muse Wonder Full</w:t>
+              <w:t>当日价格 +2.63%；固定名单不自动升级为事件</w:t>
             </w:r>
           </w:p>
         </w:tc>
@@ -3426,7 +3492,7 @@
                 <w:color w:val="141414"/>
                 <w:sz w:val="16"/>
               </w:rPr>
-              <w:t>已确认</w:t>
+              <w:t>价格/结构</w:t>
             </w:r>
           </w:p>
         </w:tc>
@@ -3452,7 +3518,7 @@
                 <w:color w:val="141414"/>
                 <w:sz w:val="16"/>
               </w:rPr>
-              <w:t>平台 AI 产品进展改善大型科技相对强度；尚不能外推为全行业硬件需求</w:t>
+              <w:t>只有找到同日产品、管理层或研究增量，才升级为事件催化</w:t>
             </w:r>
           </w:p>
         </w:tc>
@@ -3510,7 +3576,7 @@
                 <w:color w:val="141414"/>
                 <w:sz w:val="16"/>
               </w:rPr>
-              <w:t>AVGO -1.88%；当日有 CEO 对 AI 预期过高/投资者行为的二手报道</w:t>
+              <w:t>当日价格 +0.73%；本报告不重复历史财报</w:t>
             </w:r>
           </w:p>
         </w:tc>
@@ -3537,7 +3603,7 @@
                 <w:color w:val="141414"/>
                 <w:sz w:val="16"/>
               </w:rPr>
-              <w:t>二手报道</w:t>
+              <w:t>价格/结构</w:t>
             </w:r>
           </w:p>
         </w:tc>
@@ -3563,7 +3629,7 @@
                 <w:color w:val="141414"/>
                 <w:sz w:val="16"/>
               </w:rPr>
-              <w:t>更像估值与预期重估；不是新财报，不把 9/2 财报重复写成今日催化</w:t>
+              <w:t>结合半导体等权、成交和期权结构判断，不把旧财报写成今日原因</w:t>
             </w:r>
           </w:p>
         </w:tc>
@@ -3621,7 +3687,7 @@
                 <w:color w:val="141414"/>
                 <w:sz w:val="16"/>
               </w:rPr>
-              <w:t>LITE/CIEN/COHR/AAOI/CRDO 同步大跌，未见单一公司新公告</w:t>
+              <w:t>LITE/CIEN/COHR/AAOI/CRDO：LITE -0.75%、CIEN -1.14%、COHR +0.68%、AAOI -2.88%、CRDO -1.26%、FICO -2.29%、FIGS +1.47%、MDT +1.17%</w:t>
             </w:r>
           </w:p>
         </w:tc>
@@ -3648,7 +3714,7 @@
                 <w:color w:val="141414"/>
                 <w:sz w:val="16"/>
               </w:rPr>
-              <w:t>板块重定价</w:t>
+              <w:t>异常候选</w:t>
             </w:r>
           </w:p>
         </w:tc>
@@ -3674,7 +3740,7 @@
                 <w:color w:val="141414"/>
                 <w:sz w:val="16"/>
               </w:rPr>
-              <w:t>供给、估值、拥挤仓位或产业链预期同时收缩；不能硬归因于 FCC</w:t>
+              <w:t>若没有同日证据，暂归行业/估值/仓位重定价，FCC 不是默认解释</w:t>
             </w:r>
           </w:p>
         </w:tc>
@@ -3732,7 +3798,7 @@
                 <w:color w:val="141414"/>
                 <w:sz w:val="16"/>
               </w:rPr>
-              <w:t>本日未发现新财报或新指引证据</w:t>
+              <w:t>当日价格 +4.23%；未由固定名单自动触发新事件</w:t>
             </w:r>
           </w:p>
         </w:tc>
@@ -3759,7 +3825,7 @@
                 <w:color w:val="141414"/>
                 <w:sz w:val="16"/>
               </w:rPr>
-              <w:t>历史背景</w:t>
+              <w:t>价格/结构</w:t>
             </w:r>
           </w:p>
         </w:tc>
@@ -3785,7 +3851,7 @@
                 <w:color w:val="141414"/>
                 <w:sz w:val="16"/>
               </w:rPr>
-              <w:t>不纳入今日催化；只在云基础设施相对表现需要时作为背景参照</w:t>
+              <w:t>只在出现同日公告、研报、交流或指引变化时升级为公司催化</w:t>
             </w:r>
           </w:p>
         </w:tc>
@@ -3874,7 +3940,34 @@
         <w:t>AI</w:t>
       </w:r>
       <w:r>
-        <w:t xml:space="preserve"> 链条分层：Tier 1 中 </w:t>
+        <w:t xml:space="preserve"> 链条分层：Tier 1 现金流/平台代表为 </w:t>
+      </w:r>
+      <w:r>
+        <w:rPr>
+          <w:shd w:fill="E7E6E6"/>
+        </w:rPr>
+        <w:t>NVDA</w:t>
+      </w:r>
+      <w:r>
+        <w:t xml:space="preserve"> +0.97%、</w:t>
+      </w:r>
+      <w:r>
+        <w:rPr>
+          <w:shd w:fill="E7E6E6"/>
+        </w:rPr>
+        <w:t>AVGO</w:t>
+      </w:r>
+      <w:r>
+        <w:t xml:space="preserve"> +0.73%、</w:t>
+      </w:r>
+      <w:r>
+        <w:rPr>
+          <w:shd w:fill="E7E6E6"/>
+        </w:rPr>
+        <w:t>MSFT</w:t>
+      </w:r>
+      <w:r>
+        <w:t xml:space="preserve"> +0.43%、</w:t>
       </w:r>
       <w:r>
         <w:rPr>
@@ -3883,25 +3976,7 @@
         <w:t>META</w:t>
       </w:r>
       <w:r>
-        <w:t xml:space="preserve"> 逆势上涨，</w:t>
-      </w:r>
-      <w:r>
-        <w:rPr>
-          <w:shd w:fill="E7E6E6"/>
-        </w:rPr>
-        <w:t>NVDA</w:t>
-      </w:r>
-      <w:r>
-        <w:t xml:space="preserve"> -1.29%、</w:t>
-      </w:r>
-      <w:r>
-        <w:rPr>
-          <w:shd w:fill="E7E6E6"/>
-        </w:rPr>
-        <w:t>AVGO</w:t>
-      </w:r>
-      <w:r>
-        <w:t xml:space="preserve"> -1.88%，表现分化；Tier 2 的 </w:t>
+        <w:t xml:space="preserve"> +2.63%；Tier 2 网络、存储和光互联代表为 </w:t>
       </w:r>
       <w:r>
         <w:rPr>
@@ -3910,7 +3985,7 @@
         <w:t>MU</w:t>
       </w:r>
       <w:r>
-        <w:t xml:space="preserve"> -3.88%、</w:t>
+        <w:t xml:space="preserve"> -3.62%、</w:t>
       </w:r>
       <w:r>
         <w:rPr>
@@ -3919,7 +3994,7 @@
         <w:t>SNDK</w:t>
       </w:r>
       <w:r>
-        <w:t xml:space="preserve"> -5.97%、</w:t>
+        <w:t xml:space="preserve"> -0.34%、</w:t>
       </w:r>
       <w:r>
         <w:rPr>
@@ -3928,7 +4003,7 @@
         <w:t>MRVL</w:t>
       </w:r>
       <w:r>
-        <w:t xml:space="preserve"> -3.42%、</w:t>
+        <w:t xml:space="preserve"> +1.08%、</w:t>
       </w:r>
       <w:r>
         <w:rPr>
@@ -3937,7 +4012,7 @@
         <w:t>CRDO</w:t>
       </w:r>
       <w:r>
-        <w:t xml:space="preserve"> -7.25%、</w:t>
+        <w:t xml:space="preserve"> -1.26%、</w:t>
       </w:r>
       <w:r>
         <w:rPr>
@@ -3946,7 +4021,7 @@
         <w:t>LITE</w:t>
       </w:r>
       <w:r>
-        <w:t xml:space="preserve"> -9.78%、</w:t>
+        <w:t xml:space="preserve"> -0.75%、</w:t>
       </w:r>
       <w:r>
         <w:rPr>
@@ -3955,40 +4030,7 @@
         <w:t>COHR</w:t>
       </w:r>
       <w:r>
-        <w:t xml:space="preserve"> -7.87%显著承压；Tier 3 也不是同质，</w:t>
-      </w:r>
-      <w:r>
-        <w:rPr>
-          <w:shd w:fill="E7E6E6"/>
-        </w:rPr>
-        <w:t>VRT</w:t>
-      </w:r>
-      <w:r>
-        <w:t>/</w:t>
-      </w:r>
-      <w:r>
-        <w:rPr>
-          <w:shd w:fill="E7E6E6"/>
-        </w:rPr>
-        <w:t>CEG</w:t>
-      </w:r>
-      <w:r>
-        <w:t>/</w:t>
-      </w:r>
-      <w:r>
-        <w:rPr>
-          <w:shd w:fill="E7E6E6"/>
-        </w:rPr>
-        <w:t>NRG</w:t>
-      </w:r>
-      <w:r>
-        <w:t xml:space="preserve"> 受能源与电力叙事影响相对独立。今天不是“</w:t>
-      </w:r>
-      <w:r>
-        <w:t>AI</w:t>
-      </w:r>
-      <w:r>
-        <w:t xml:space="preserve"> 全线崩”，而是资金把最依赖持续加速订单、估值和资本开支预期的二阶硬件资产先降仓。</w:t>
+        <w:t xml:space="preserve"> +0.68%。这组数据只能说明当天价格速度和相对分化，不能单独证明订单、客户或资本开支发生变化；后者需要公司公告、会议或可复核产业数据。</w:t>
       </w:r>
     </w:p>
     <w:p>
@@ -4049,34 +4091,52 @@
         <w:spacing w:after="120" w:line="276" w:lineRule="auto"/>
       </w:pPr>
       <w:r>
-        <w:t>异动原因必须逐个核验：</w:t>
+        <w:t xml:space="preserve">异动原因必须逐个核验：按绝对涨跌筛出的候选为 </w:t>
       </w:r>
       <w:r>
         <w:rPr>
           <w:shd w:fill="E7E6E6"/>
         </w:rPr>
-        <w:t>FICO</w:t>
+        <w:t>AMAT</w:t>
       </w:r>
       <w:r>
-        <w:t xml:space="preserve"> +10.85%伴随约 2.16 倍成交，属于强催化/预期重估候选，但本次公开数据未给出足够单一事件证据，标注为“待验”；</w:t>
+        <w:t xml:space="preserve"> -6.69%（成交约1.52x均量）；</w:t>
       </w:r>
       <w:r>
         <w:rPr>
           <w:shd w:fill="E7E6E6"/>
         </w:rPr>
-        <w:t>FIGS</w:t>
+        <w:t>JNJ</w:t>
       </w:r>
       <w:r>
-        <w:t xml:space="preserve"> +12.42%伴随约 3.83 倍成交，需核查业绩、产品或卖方报告；</w:t>
+        <w:t xml:space="preserve"> -5.73%（成交约3.78x均量）；C -5.60%（成交约3.44x均量）；</w:t>
       </w:r>
       <w:r>
         <w:rPr>
           <w:shd w:fill="E7E6E6"/>
         </w:rPr>
-        <w:t>MDT</w:t>
+        <w:t>IONQ</w:t>
       </w:r>
       <w:r>
-        <w:t xml:space="preserve"> +3.90%相对医疗器械 ETF走强，属于行业内部 Alpha。反面是光通信簇跌幅接近 -8%至 -10%，而非通信服务 ETF同步大跌，说明个股/子行业因素占主导。</w:t>
+        <w:t xml:space="preserve"> -4.25%（成交约2.91x均量）；</w:t>
+      </w:r>
+      <w:r>
+        <w:rPr>
+          <w:shd w:fill="E7E6E6"/>
+        </w:rPr>
+        <w:t>ORCL</w:t>
+      </w:r>
+      <w:r>
+        <w:t xml:space="preserve"> +4.23%（成交约0.70x均量）；</w:t>
+      </w:r>
+      <w:r>
+        <w:rPr>
+          <w:shd w:fill="E7E6E6"/>
+        </w:rPr>
+        <w:t>MU</w:t>
+      </w:r>
+      <w:r>
+        <w:t xml:space="preserve"> -3.62%（成交约1.38x均量）。这些名字先记录为价格/成交异常，随后核对同日公告、研报、公司交流、行业数据或传闻原始出处；没有证据时保留“待验”，不把涨跌倒推成原因。</w:t>
       </w:r>
     </w:p>
     <w:p>
@@ -5633,16 +5693,61 @@
         <w:spacing w:after="120" w:line="276" w:lineRule="auto"/>
       </w:pPr>
       <w:r>
-        <w:t xml:space="preserve">资金主线不是单一板块，而是三条并行路径：第一，能源与必选消费承接宏观不确定性；第二，通信服务由 </w:t>
+        <w:t xml:space="preserve">资金主线判断基于价格偏好代理：板块前列为 </w:t>
       </w:r>
       <w:r>
         <w:rPr>
           <w:shd w:fill="E7E6E6"/>
         </w:rPr>
-        <w:t>META</w:t>
+        <w:t>XLE</w:t>
       </w:r>
       <w:r>
-        <w:t xml:space="preserve"> 和运营商支撑，表现为平台/现金流而非纯成长扩张；第三，科技内部从 Tier 2 高弹性硬件向 Tier 1 平台与防御性资产收缩。广度为正且 </w:t>
+        <w:t>（能源）+1.80%、</w:t>
+      </w:r>
+      <w:r>
+        <w:rPr>
+          <w:shd w:fill="E7E6E6"/>
+        </w:rPr>
+        <w:t>XLC</w:t>
+      </w:r>
+      <w:r>
+        <w:t>（通信服务）+0.74%、</w:t>
+      </w:r>
+      <w:r>
+        <w:rPr>
+          <w:shd w:fill="E7E6E6"/>
+        </w:rPr>
+        <w:t>XHB</w:t>
+      </w:r>
+      <w:r>
+        <w:t xml:space="preserve">（住宅建筑）+0.62%，后列为 </w:t>
+      </w:r>
+      <w:r>
+        <w:rPr>
+          <w:shd w:fill="E7E6E6"/>
+        </w:rPr>
+        <w:t>XLV</w:t>
+      </w:r>
+      <w:r>
+        <w:t>（医疗保健）-1.35%、</w:t>
+      </w:r>
+      <w:r>
+        <w:rPr>
+          <w:shd w:fill="E7E6E6"/>
+        </w:rPr>
+        <w:t>GDX</w:t>
+      </w:r>
+      <w:r>
+        <w:t>（黄金矿业）-1.46%、</w:t>
+      </w:r>
+      <w:r>
+        <w:rPr>
+          <w:shd w:fill="E7E6E6"/>
+        </w:rPr>
+        <w:t>XBI</w:t>
+      </w:r>
+      <w:r>
+        <w:t>（生物医药）-3.04%；S&amp;P 广度上涨占比 52.7%，</w:t>
       </w:r>
       <w:r>
         <w:rPr>
@@ -5651,7 +5756,7 @@
         <w:t>RSP</w:t>
       </w:r>
       <w:r>
-        <w:t xml:space="preserve"> 跑赢 </w:t>
+        <w:t xml:space="preserve"> +0.05% 对比 </w:t>
       </w:r>
       <w:r>
         <w:rPr>
@@ -5660,25 +5765,19 @@
         <w:t>SPY</w:t>
       </w:r>
       <w:r>
-        <w:t xml:space="preserve">，说明有真实参与，但 </w:t>
+        <w:t xml:space="preserve"> -0.01%。这能支持参与度和相对偏好的判断，但没有直接基金流、</w:t>
       </w:r>
       <w:r>
-        <w:rPr>
-          <w:shd w:fill="E7E6E6"/>
-        </w:rPr>
-        <w:t>QQQ</w:t>
+        <w:t>PB</w:t>
       </w:r>
       <w:r>
-        <w:t xml:space="preserve"> 跑输 </w:t>
+        <w:t xml:space="preserve"> 或 </w:t>
       </w:r>
       <w:r>
-        <w:rPr>
-          <w:shd w:fill="E7E6E6"/>
-        </w:rPr>
-        <w:t>RSP</w:t>
+        <w:t>CTA</w:t>
       </w:r>
       <w:r>
-        <w:t>、High Beta 跑输 Low Vol，说明增量资金更挑剔。</w:t>
+        <w:t xml:space="preserve"> 数据时，不写成确认的净流入/净流出。</w:t>
       </w:r>
     </w:p>
     <w:p>
@@ -7808,7 +7907,7 @@
           <w:color w:val="555555"/>
           <w:sz w:val="17"/>
         </w:rPr>
-        <w:t>图：公开期权链异常扫描。来源/口径：Nasdaq public option-chain endpoint；检查时点 2026-10-13 19:41 ET；无执行方向确认。。</w:t>
+        <w:t>图：公开期权链异常扫描。来源/口径：Nasdaq public option-chain endpoint；检查时点 2026-10-13T20:25:50-04:00；无执行方向确认。。</w:t>
       </w:r>
     </w:p>
     <w:p>
@@ -7816,7 +7915,7 @@
         <w:spacing w:after="120" w:line="276" w:lineRule="auto"/>
       </w:pPr>
       <w:r>
-        <w:t>解读规则：</w:t>
+        <w:t xml:space="preserve">解读规则：本次触发异常阈值的标的为 </w:t>
       </w:r>
       <w:r>
         <w:rPr>
@@ -7825,22 +7924,67 @@
         <w:t>CIEN</w:t>
       </w:r>
       <w:r>
-        <w:t xml:space="preserve"> 的远月执行价集中度约 46.98%、</w:t>
+        <w:t xml:space="preserve">, </w:t>
       </w:r>
       <w:r>
         <w:rPr>
           <w:shd w:fill="E7E6E6"/>
         </w:rPr>
-        <w:t>AAOI</w:t>
+        <w:t>MU</w:t>
       </w:r>
       <w:r>
-        <w:t xml:space="preserve"> 约 21.18%、</w:t>
+        <w:t xml:space="preserve">, </w:t>
+      </w:r>
+      <w:r>
+        <w:rPr>
+          <w:shd w:fill="E7E6E6"/>
+        </w:rPr>
+        <w:t>NVDA</w:t>
+      </w:r>
+      <w:r>
+        <w:t xml:space="preserve">, </w:t>
+      </w:r>
+      <w:r>
+        <w:rPr>
+          <w:shd w:fill="E7E6E6"/>
+        </w:rPr>
+        <w:t>AVGO</w:t>
+      </w:r>
+      <w:r>
+        <w:t xml:space="preserve">, </w:t>
+      </w:r>
+      <w:r>
+        <w:rPr>
+          <w:shd w:fill="E7E6E6"/>
+        </w:rPr>
+        <w:t>META</w:t>
+      </w:r>
+      <w:r>
+        <w:t xml:space="preserve">, </w:t>
+      </w:r>
+      <w:r>
+        <w:rPr>
+          <w:shd w:fill="E7E6E6"/>
+        </w:rPr>
+        <w:t>FICO</w:t>
+      </w:r>
+      <w:r>
+        <w:t xml:space="preserve">, </w:t>
       </w:r>
       <w:r>
         <w:t>TWST</w:t>
       </w:r>
       <w:r>
-        <w:t xml:space="preserve"> 约 28.97%、</w:t>
+        <w:t xml:space="preserve">, </w:t>
+      </w:r>
+      <w:r>
+        <w:rPr>
+          <w:shd w:fill="E7E6E6"/>
+        </w:rPr>
+        <w:t>CRDO</w:t>
+      </w:r>
+      <w:r>
+        <w:t xml:space="preserve">, </w:t>
       </w:r>
       <w:r>
         <w:rPr>
@@ -7849,28 +7993,13 @@
         <w:t>MRVL</w:t>
       </w:r>
       <w:r>
-        <w:t xml:space="preserve"> 约 22.40%，说明成交/未平仓结构可能围绕少数执行价聚集，常见含义包括事件对冲、做市商库存管理、价位 pinning 或投机性集中下注；它不等于“看涨/看跌”。</w:t>
+        <w:t xml:space="preserve">, </w:t>
       </w:r>
       <w:r>
-        <w:rPr>
-          <w:shd w:fill="E7E6E6"/>
-        </w:rPr>
-        <w:t>MU</w:t>
+        <w:t>GME</w:t>
       </w:r>
       <w:r>
-        <w:t xml:space="preserve"> 同时触发 Call Volume/</w:t>
-      </w:r>
-      <w:r>
-        <w:t>OI</w:t>
-      </w:r>
-      <w:r>
-        <w:t xml:space="preserve"> 与 Put Volume/</w:t>
-      </w:r>
-      <w:r>
-        <w:t>OI</w:t>
-      </w:r>
-      <w:r>
-        <w:t xml:space="preserve"> 阈值，说明期权活跃度异常，但公开链没有买卖方向、开平仓、扫单/大宗标签，不能把它写成净买入或净卖出。</w:t>
+        <w:t>。执行价集中度只能说明成交/未平仓结构围绕少数执行价聚集，可能对应事件对冲、做市商库存管理、价位 pinning 或投机性集中下注；在没有执行侧、开平仓、扫单/大宗标签时，不等于看涨、看跌、净买入或净卖出。</w:t>
       </w:r>
     </w:p>
     <w:p>
@@ -8979,19 +9108,13 @@
         <w:spacing w:after="120" w:line="276" w:lineRule="auto"/>
       </w:pPr>
       <w:r>
-        <w:t xml:space="preserve">数据完整性：Yahoo Finance Chart </w:t>
+        <w:t xml:space="preserve">数据完整性：核心日线若缺少目标日收盘，则由 Yahoo Chart </w:t>
       </w:r>
       <w:r>
         <w:t>API</w:t>
       </w:r>
       <w:r>
-        <w:t xml:space="preserve"> 取得收盘与历史收益；S&amp;P 500 成分广度抓取成功 503/503；期权链抓取成功但为公开链快照；盘中 5分钟数据接口返回空序列，</w:t>
-      </w:r>
-      <w:r>
-        <w:t>MOC</w:t>
-      </w:r>
-      <w:r>
-        <w:t>/尾盘20分钟不可得；</w:t>
+        <w:t xml:space="preserve"> 的目标交易日 5分钟常规现金盘聚合重建，并在运行日志保留该口径；S&amp;P 500 成分广度与行业代理均经过目标日校验。期权链为公开快照，</w:t>
       </w:r>
       <w:r>
         <w:t>PB</w:t>
@@ -9009,7 +9132,7 @@
         <w:t>GEX</w:t>
       </w:r>
       <w:r>
-        <w:t>、执行方向均不可得。所有不可得项均保留为“不可得”，没有用估计值替代。</w:t>
+        <w:t>、执行方向仍不可得；所有不可得项均保留为“不可得”，没有用估计值替代。</w:t>
       </w:r>
     </w:p>
     <w:p>

</xml_diff>